<commit_message>
docs: update student registration number to RA2511026030018 across all report documents
</commit_message>
<xml_diff>
--- a/docs/STUDENT_MANAGEMENT_SYSTEM_PROJECT_REPORT.docx
+++ b/docs/STUDENT_MANAGEMENT_SYSTEM_PROJECT_REPORT.docx
@@ -71,7 +71,7 @@
           <w:b/>
           <w:sz w:val="26"/>
         </w:rPr>
-        <w:t>GAURAV SINGH  RA2411026030097</w:t>
+        <w:t>GAURAV SINGH  RA2511026030018</w:t>
       </w:r>
     </w:p>
     <w:p>
@@ -257,7 +257,7 @@
           <w:rFonts w:ascii="Times New Roman" w:hAnsi="Times New Roman"/>
           <w:sz w:val="24"/>
         </w:rPr>
-        <w:t>Certified that this project report titled STUDENT MANAGEMENT SYSTEM is the bonafide work of GAURAV SINGH (RA2411026030097) who carried out the project work under my supervision. Certified further, that to the best of my knowledge the work reported herein does not form any other project report or dissertation on the basis of which a degree or award was conferred on an occasion on this or any other candidate.</w:t>
+        <w:t>Certified that this project report titled STUDENT MANAGEMENT SYSTEM is the bonafide work of GAURAV SINGH (RA2511026030018) who carried out the project work under my supervision. Certified further, that to the best of my knowledge the work reported herein does not form any other project report or dissertation on the basis of which a degree or award was conferred on an occasion on this or any other candidate.</w:t>
       </w:r>
     </w:p>
     <w:tbl>
@@ -386,7 +386,7 @@
           <w:rFonts w:ascii="Times New Roman" w:hAnsi="Times New Roman"/>
           <w:sz w:val="24"/>
         </w:rPr>
-        <w:t>I hereby declare that the entire work contained in this project report titled STUDENT MANAGEMENT SYSTEM has been carried out by GAURAV SINGH (RA2411026030097) at SRM Institute of Science and Technology, Delhi-NCR, under the guidance of Dr. S. Palanivel, Associate Professor, Department of Computer Science and Engineering.</w:t>
+        <w:t>I hereby declare that the entire work contained in this project report titled STUDENT MANAGEMENT SYSTEM has been carried out by GAURAV SINGH (RA2511026030018) at SRM Institute of Science and Technology, Delhi-NCR, under the guidance of Dr. S. Palanivel, Associate Professor, Department of Computer Science and Engineering.</w:t>
       </w:r>
     </w:p>
     <w:p>
@@ -397,7 +397,7 @@
         <w:rPr>
           <w:b/>
         </w:rPr>
-        <w:t>GAURAV SINGH (RA2411026030097)</w:t>
+        <w:t>GAURAV SINGH (RA2511026030018)</w:t>
         <w:br/>
         <w:t>Department of Computer Science &amp; Engineering</w:t>
         <w:br/>

</xml_diff>

<commit_message>
docs: align cover page identically with SRM template including SRM logo and exact layout
</commit_message>
<xml_diff>
--- a/docs/STUDENT_MANAGEMENT_SYSTEM_PROJECT_REPORT.docx
+++ b/docs/STUDENT_MANAGEMENT_SYSTEM_PROJECT_REPORT.docx
@@ -4,35 +4,21 @@
   <w:body>
     <w:p>
       <w:pPr>
-        <w:spacing w:before="120" w:after="120"/>
+        <w:spacing w:before="120" w:after="40"/>
         <w:jc w:val="center"/>
       </w:pPr>
       <w:r>
         <w:rPr>
           <w:rFonts w:ascii="Times New Roman" w:hAnsi="Times New Roman"/>
           <w:b/>
-          <w:sz w:val="36"/>
+          <w:sz w:val="30"/>
         </w:rPr>
         <w:t>STUDENT MANAGEMENT SYSTEM</w:t>
       </w:r>
     </w:p>
     <w:p>
       <w:pPr>
-        <w:spacing w:before="120" w:after="360"/>
-        <w:jc w:val="center"/>
-      </w:pPr>
-      <w:r>
-        <w:rPr>
-          <w:rFonts w:ascii="Times New Roman" w:hAnsi="Times New Roman"/>
-          <w:b/>
-          <w:sz w:val="28"/>
-        </w:rPr>
-        <w:t>ACADEMIC ERP &amp; CLOUD PLATFORM</w:t>
-      </w:r>
-    </w:p>
-    <w:p>
-      <w:pPr>
-        <w:spacing w:before="120" w:after="720"/>
+        <w:spacing w:before="120" w:after="640"/>
         <w:jc w:val="center"/>
       </w:pPr>
       <w:r>
@@ -41,14 +27,14 @@
           <w:b/>
           <w:sz w:val="26"/>
         </w:rPr>
-        <w:t>21CSC203P/ADVANCED PROGRAMMING PRACTICE</w:t>
+        <w:t>21CSC203P/ADVANCED PROGRAMMING</w:t>
         <w:br/>
-        <w:t>PROJECT REPORT</w:t>
+        <w:t>PRACTICE PROJECT REPORT</w:t>
       </w:r>
     </w:p>
     <w:p>
       <w:pPr>
-        <w:spacing w:before="120" w:after="160"/>
+        <w:spacing w:before="120" w:after="120"/>
         <w:jc w:val="center"/>
       </w:pPr>
       <w:r>
@@ -62,7 +48,7 @@
     </w:p>
     <w:p>
       <w:pPr>
-        <w:spacing w:before="120" w:after="720"/>
+        <w:spacing w:before="120" w:after="640"/>
         <w:jc w:val="center"/>
       </w:pPr>
       <w:r>
@@ -71,12 +57,12 @@
           <w:b/>
           <w:sz w:val="26"/>
         </w:rPr>
-        <w:t>GAURAV SINGH  RA2511026030018</w:t>
+        <w:t>GAURAV SINGH RA2511026030018</w:t>
       </w:r>
     </w:p>
     <w:p>
       <w:pPr>
-        <w:spacing w:before="120" w:after="160"/>
+        <w:spacing w:before="120" w:after="120"/>
         <w:jc w:val="center"/>
       </w:pPr>
       <w:r>
@@ -104,7 +90,7 @@
     </w:p>
     <w:p>
       <w:pPr>
-        <w:spacing w:before="120" w:after="720"/>
+        <w:spacing w:before="120" w:after="640"/>
         <w:jc w:val="center"/>
       </w:pPr>
       <w:r>
@@ -113,12 +99,14 @@
           <w:b w:val="0"/>
           <w:sz w:val="22"/>
         </w:rPr>
-        <w:t>(Associate Professor, Department of Computer Science and Engineering)</w:t>
+        <w:t>(Associate Professor, Department of</w:t>
+        <w:br/>
+        <w:t>Computer Science and Engineering)</w:t>
       </w:r>
     </w:p>
     <w:p>
       <w:pPr>
-        <w:spacing w:before="120" w:after="120"/>
+        <w:spacing w:before="120" w:after="80"/>
         <w:jc w:val="center"/>
       </w:pPr>
       <w:r>
@@ -127,7 +115,9 @@
           <w:b w:val="0"/>
           <w:sz w:val="22"/>
         </w:rPr>
-        <w:t>in partial fulfilment for the award of the degree of</w:t>
+        <w:t>in partial fulfilment for the award of the degree</w:t>
+        <w:br/>
+        <w:t>of</w:t>
       </w:r>
     </w:p>
     <w:p>
@@ -160,7 +150,7 @@
     </w:p>
     <w:p>
       <w:pPr>
-        <w:spacing w:before="120" w:after="360"/>
+        <w:spacing w:before="120" w:after="240"/>
         <w:jc w:val="center"/>
       </w:pPr>
       <w:r>
@@ -181,23 +171,79 @@
         <w:rPr>
           <w:rFonts w:ascii="Times New Roman" w:hAnsi="Times New Roman"/>
           <w:b/>
-          <w:sz w:val="24"/>
+          <w:sz w:val="23"/>
         </w:rPr>
-        <w:t>FACULTY OF ENGINEERING AND TECHNOLOGY</w:t>
+        <w:t>Of</w:t>
+        <w:br/>
+        <w:t>FACULTY OF ENGINEERING AND</w:t>
       </w:r>
     </w:p>
     <w:p>
       <w:pPr>
-        <w:spacing w:before="120" w:after="240"/>
+        <w:spacing w:before="40" w:after="80"/>
+        <w:jc w:val="center"/>
+      </w:pPr>
+      <w:r>
+        <w:drawing>
+          <wp:inline xmlns:a="http://schemas.openxmlformats.org/drawingml/2006/main" xmlns:pic="http://schemas.openxmlformats.org/drawingml/2006/picture">
+            <wp:extent cx="1645920" cy="640080"/>
+            <wp:docPr id="1" name="Picture 1"/>
+            <wp:cNvGraphicFramePr>
+              <a:graphicFrameLocks noChangeAspect="1"/>
+            </wp:cNvGraphicFramePr>
+            <a:graphic>
+              <a:graphicData uri="http://schemas.openxmlformats.org/drawingml/2006/picture">
+                <pic:pic>
+                  <pic:nvPicPr>
+                    <pic:cNvPr id="0" name="srm_logo_0.png"/>
+                    <pic:cNvPicPr/>
+                  </pic:nvPicPr>
+                  <pic:blipFill>
+                    <a:blip r:embed="rId9"/>
+                    <a:stretch>
+                      <a:fillRect/>
+                    </a:stretch>
+                  </pic:blipFill>
+                  <pic:spPr>
+                    <a:xfrm>
+                      <a:off x="0" y="0"/>
+                      <a:ext cx="1645920" cy="640080"/>
+                    </a:xfrm>
+                    <a:prstGeom prst="rect"/>
+                  </pic:spPr>
+                </pic:pic>
+              </a:graphicData>
+            </a:graphic>
+          </wp:inline>
+        </w:drawing>
+      </w:r>
+    </w:p>
+    <w:p>
+      <w:pPr>
+        <w:spacing w:before="120" w:after="480"/>
         <w:jc w:val="center"/>
       </w:pPr>
       <w:r>
         <w:rPr>
           <w:rFonts w:ascii="Times New Roman" w:hAnsi="Times New Roman"/>
           <w:b/>
-          <w:sz w:val="26"/>
+          <w:sz w:val="24"/>
         </w:rPr>
-        <w:t>SRM INSTITUTE OF SCIENCE &amp; TECHNOLOGY, DELHI-NCR CAMPUS</w:t>
+        <w:t>TECHNOLOGY</w:t>
+      </w:r>
+    </w:p>
+    <w:p>
+      <w:pPr>
+        <w:spacing w:before="120" w:after="240"/>
+        <w:jc w:val="center"/>
+      </w:pPr>
+      <w:r>
+        <w:rPr>
+          <w:rFonts w:ascii="Times New Roman" w:hAnsi="Times New Roman"/>
+          <w:b/>
+          <w:sz w:val="24"/>
+        </w:rPr>
+        <w:t>SRM INSTITUTE OF SCIENCE &amp; TECHNOLOGY, NCR CAMPUS</w:t>
       </w:r>
     </w:p>
     <w:p>
@@ -3222,7 +3268,7 @@
         <w:drawing>
           <wp:inline xmlns:a="http://schemas.openxmlformats.org/drawingml/2006/main" xmlns:pic="http://schemas.openxmlformats.org/drawingml/2006/picture">
             <wp:extent cx="5303520" cy="2892829"/>
-            <wp:docPr id="1" name="Picture 1"/>
+            <wp:docPr id="2" name="Picture 2"/>
             <wp:cNvGraphicFramePr>
               <a:graphicFrameLocks noChangeAspect="1"/>
             </wp:cNvGraphicFramePr>
@@ -3234,7 +3280,7 @@
                     <pic:cNvPicPr/>
                   </pic:nvPicPr>
                   <pic:blipFill>
-                    <a:blip r:embed="rId9"/>
+                    <a:blip r:embed="rId10"/>
                     <a:stretch>
                       <a:fillRect/>
                     </a:stretch>
@@ -3369,7 +3415,7 @@
         <w:drawing>
           <wp:inline xmlns:a="http://schemas.openxmlformats.org/drawingml/2006/main" xmlns:pic="http://schemas.openxmlformats.org/drawingml/2006/picture">
             <wp:extent cx="5303520" cy="2892829"/>
-            <wp:docPr id="2" name="Picture 2"/>
+            <wp:docPr id="3" name="Picture 3"/>
             <wp:cNvGraphicFramePr>
               <a:graphicFrameLocks noChangeAspect="1"/>
             </wp:cNvGraphicFramePr>
@@ -3381,7 +3427,7 @@
                     <pic:cNvPicPr/>
                   </pic:nvPicPr>
                   <pic:blipFill>
-                    <a:blip r:embed="rId10"/>
+                    <a:blip r:embed="rId11"/>
                     <a:stretch>
                       <a:fillRect/>
                     </a:stretch>
@@ -4162,7 +4208,7 @@
         <w:drawing>
           <wp:inline xmlns:a="http://schemas.openxmlformats.org/drawingml/2006/main" xmlns:pic="http://schemas.openxmlformats.org/drawingml/2006/picture">
             <wp:extent cx="5303520" cy="3314700"/>
-            <wp:docPr id="3" name="Picture 3"/>
+            <wp:docPr id="4" name="Picture 4"/>
             <wp:cNvGraphicFramePr>
               <a:graphicFrameLocks noChangeAspect="1"/>
             </wp:cNvGraphicFramePr>
@@ -4171,87 +4217,6 @@
                 <pic:pic>
                   <pic:nvPicPr>
                     <pic:cNvPr id="0" name="fig5_1_home_dashboard.png"/>
-                    <pic:cNvPicPr/>
-                  </pic:nvPicPr>
-                  <pic:blipFill>
-                    <a:blip r:embed="rId11"/>
-                    <a:stretch>
-                      <a:fillRect/>
-                    </a:stretch>
-                  </pic:blipFill>
-                  <pic:spPr>
-                    <a:xfrm>
-                      <a:off x="0" y="0"/>
-                      <a:ext cx="5303520" cy="3314700"/>
-                    </a:xfrm>
-                    <a:prstGeom prst="rect"/>
-                  </pic:spPr>
-                </pic:pic>
-              </a:graphicData>
-            </a:graphic>
-          </wp:inline>
-        </w:drawing>
-      </w:r>
-    </w:p>
-    <w:p>
-      <w:pPr>
-        <w:spacing w:after="240"/>
-        <w:jc w:val="center"/>
-      </w:pPr>
-      <w:r>
-        <w:rPr>
-          <w:rFonts w:ascii="Times New Roman" w:hAnsi="Times New Roman"/>
-          <w:b/>
-          <w:sz w:val="21"/>
-        </w:rPr>
-        <w:t>Figure 5.1: Home Page &amp; Real-Time Academic KPI Dashboard (Live on Vercel)</w:t>
-      </w:r>
-    </w:p>
-    <w:p>
-      <w:pPr>
-        <w:spacing w:before="280" w:after="120"/>
-        <w:jc w:val="left"/>
-      </w:pPr>
-      <w:r>
-        <w:rPr>
-          <w:rFonts w:ascii="Times New Roman" w:hAnsi="Times New Roman"/>
-          <w:b/>
-          <w:sz w:val="25"/>
-        </w:rPr>
-        <w:t>5.2 Student Directory &amp; Lifecycle Management</w:t>
-      </w:r>
-    </w:p>
-    <w:p>
-      <w:pPr>
-        <w:spacing w:after="120" w:line="324" w:lineRule="auto"/>
-        <w:jc w:val="both"/>
-      </w:pPr>
-      <w:r>
-        <w:rPr>
-          <w:rFonts w:ascii="Times New Roman" w:hAnsi="Times New Roman"/>
-          <w:sz w:val="24"/>
-        </w:rPr>
-        <w:t>The Student Management interface allows administrators to search student records by name or roll number, filter cohorts by academic department (Computer Science, Electrical, Mechanical), and register new students.</w:t>
-      </w:r>
-    </w:p>
-    <w:p>
-      <w:pPr>
-        <w:spacing w:before="160" w:after="80"/>
-        <w:jc w:val="center"/>
-      </w:pPr>
-      <w:r>
-        <w:drawing>
-          <wp:inline xmlns:a="http://schemas.openxmlformats.org/drawingml/2006/main" xmlns:pic="http://schemas.openxmlformats.org/drawingml/2006/picture">
-            <wp:extent cx="5303520" cy="3314700"/>
-            <wp:docPr id="4" name="Picture 4"/>
-            <wp:cNvGraphicFramePr>
-              <a:graphicFrameLocks noChangeAspect="1"/>
-            </wp:cNvGraphicFramePr>
-            <a:graphic>
-              <a:graphicData uri="http://schemas.openxmlformats.org/drawingml/2006/picture">
-                <pic:pic>
-                  <pic:nvPicPr>
-                    <pic:cNvPr id="0" name="fig5_2_students_directory.png"/>
                     <pic:cNvPicPr/>
                   </pic:nvPicPr>
                   <pic:blipFill>
@@ -4285,7 +4250,7 @@
           <w:b/>
           <w:sz w:val="21"/>
         </w:rPr>
-        <w:t>Figure 5.2: Student Directory with Dynamic Search &amp; Department Filtering</w:t>
+        <w:t>Figure 5.1: Home Page &amp; Real-Time Academic KPI Dashboard (Live on Vercel)</w:t>
       </w:r>
     </w:p>
     <w:p>
@@ -4299,7 +4264,7 @@
           <w:b/>
           <w:sz w:val="25"/>
         </w:rPr>
-        <w:t>5.3 Course Catalog &amp; Seat Occupancy</w:t>
+        <w:t>5.2 Student Directory &amp; Lifecycle Management</w:t>
       </w:r>
     </w:p>
     <w:p>
@@ -4312,7 +4277,7 @@
           <w:rFonts w:ascii="Times New Roman" w:hAnsi="Times New Roman"/>
           <w:sz w:val="24"/>
         </w:rPr>
-        <w:t>The Course Catalog displays active curriculum offerings with assigned instructors, credit units, and live seat occupancy meters, preventing manual scheduling conflicts.</w:t>
+        <w:t>The Student Management interface allows administrators to search student records by name or roll number, filter cohorts by academic department (Computer Science, Electrical, Mechanical), and register new students.</w:t>
       </w:r>
     </w:p>
     <w:p>
@@ -4332,7 +4297,7 @@
               <a:graphicData uri="http://schemas.openxmlformats.org/drawingml/2006/picture">
                 <pic:pic>
                   <pic:nvPicPr>
-                    <pic:cNvPr id="0" name="fig5_3_course_catalog.png"/>
+                    <pic:cNvPr id="0" name="fig5_2_students_directory.png"/>
                     <pic:cNvPicPr/>
                   </pic:nvPicPr>
                   <pic:blipFill>
@@ -4366,7 +4331,7 @@
           <w:b/>
           <w:sz w:val="21"/>
         </w:rPr>
-        <w:t>Figure 5.3: Course Catalog Interface with Seat Capacity Meters</w:t>
+        <w:t>Figure 5.2: Student Directory with Dynamic Search &amp; Department Filtering</w:t>
       </w:r>
     </w:p>
     <w:p>
@@ -4380,7 +4345,7 @@
           <w:b/>
           <w:sz w:val="25"/>
         </w:rPr>
-        <w:t>5.4 Course Enrollment &amp; Real-Time Grading</w:t>
+        <w:t>5.3 Course Catalog &amp; Seat Occupancy</w:t>
       </w:r>
     </w:p>
     <w:p>
@@ -4393,7 +4358,7 @@
           <w:rFonts w:ascii="Times New Roman" w:hAnsi="Times New Roman"/>
           <w:sz w:val="24"/>
         </w:rPr>
-        <w:t>The Enrollment Oversight module lists student enrollments with direct actions for updating academic grades and modifying registration statuses.</w:t>
+        <w:t>The Course Catalog displays active curriculum offerings with assigned instructors, credit units, and live seat occupancy meters, preventing manual scheduling conflicts.</w:t>
       </w:r>
     </w:p>
     <w:p>
@@ -4413,7 +4378,7 @@
               <a:graphicData uri="http://schemas.openxmlformats.org/drawingml/2006/picture">
                 <pic:pic>
                   <pic:nvPicPr>
-                    <pic:cNvPr id="0" name="fig5_4_enrollments_management.png"/>
+                    <pic:cNvPr id="0" name="fig5_3_course_catalog.png"/>
                     <pic:cNvPicPr/>
                   </pic:nvPicPr>
                   <pic:blipFill>
@@ -4447,7 +4412,7 @@
           <w:b/>
           <w:sz w:val="21"/>
         </w:rPr>
-        <w:t>Figure 5.4: Enrollment Oversight Table with Live Grade Status</w:t>
+        <w:t>Figure 5.3: Course Catalog Interface with Seat Capacity Meters</w:t>
       </w:r>
     </w:p>
     <w:p>
@@ -4461,7 +4426,7 @@
           <w:b/>
           <w:sz w:val="25"/>
         </w:rPr>
-        <w:t>5.5 Evaluation &amp; Status Update Modal</w:t>
+        <w:t>5.4 Course Enrollment &amp; Real-Time Grading</w:t>
       </w:r>
     </w:p>
     <w:p>
@@ -4474,7 +4439,7 @@
           <w:rFonts w:ascii="Times New Roman" w:hAnsi="Times New Roman"/>
           <w:sz w:val="24"/>
         </w:rPr>
-        <w:t>A responsive modal dialog allows instructors and administrators to evaluate student performance, assign standard letter grades (A, B, C, D, F), and transition enrollment statuses (ACTIVE, COMPLETED, DROPPED).</w:t>
+        <w:t>The Enrollment Oversight module lists student enrollments with direct actions for updating academic grades and modifying registration statuses.</w:t>
       </w:r>
     </w:p>
     <w:p>
@@ -4494,7 +4459,7 @@
               <a:graphicData uri="http://schemas.openxmlformats.org/drawingml/2006/picture">
                 <pic:pic>
                   <pic:nvPicPr>
-                    <pic:cNvPr id="0" name="fig5_5_grade_evaluation_modal.png"/>
+                    <pic:cNvPr id="0" name="fig5_4_enrollments_management.png"/>
                     <pic:cNvPicPr/>
                   </pic:nvPicPr>
                   <pic:blipFill>
@@ -4528,6 +4493,87 @@
           <w:b/>
           <w:sz w:val="21"/>
         </w:rPr>
+        <w:t>Figure 5.4: Enrollment Oversight Table with Live Grade Status</w:t>
+      </w:r>
+    </w:p>
+    <w:p>
+      <w:pPr>
+        <w:spacing w:before="280" w:after="120"/>
+        <w:jc w:val="left"/>
+      </w:pPr>
+      <w:r>
+        <w:rPr>
+          <w:rFonts w:ascii="Times New Roman" w:hAnsi="Times New Roman"/>
+          <w:b/>
+          <w:sz w:val="25"/>
+        </w:rPr>
+        <w:t>5.5 Evaluation &amp; Status Update Modal</w:t>
+      </w:r>
+    </w:p>
+    <w:p>
+      <w:pPr>
+        <w:spacing w:after="120" w:line="324" w:lineRule="auto"/>
+        <w:jc w:val="both"/>
+      </w:pPr>
+      <w:r>
+        <w:rPr>
+          <w:rFonts w:ascii="Times New Roman" w:hAnsi="Times New Roman"/>
+          <w:sz w:val="24"/>
+        </w:rPr>
+        <w:t>A responsive modal dialog allows instructors and administrators to evaluate student performance, assign standard letter grades (A, B, C, D, F), and transition enrollment statuses (ACTIVE, COMPLETED, DROPPED).</w:t>
+      </w:r>
+    </w:p>
+    <w:p>
+      <w:pPr>
+        <w:spacing w:before="160" w:after="80"/>
+        <w:jc w:val="center"/>
+      </w:pPr>
+      <w:r>
+        <w:drawing>
+          <wp:inline xmlns:a="http://schemas.openxmlformats.org/drawingml/2006/main" xmlns:pic="http://schemas.openxmlformats.org/drawingml/2006/picture">
+            <wp:extent cx="5303520" cy="3314700"/>
+            <wp:docPr id="8" name="Picture 8"/>
+            <wp:cNvGraphicFramePr>
+              <a:graphicFrameLocks noChangeAspect="1"/>
+            </wp:cNvGraphicFramePr>
+            <a:graphic>
+              <a:graphicData uri="http://schemas.openxmlformats.org/drawingml/2006/picture">
+                <pic:pic>
+                  <pic:nvPicPr>
+                    <pic:cNvPr id="0" name="fig5_5_grade_evaluation_modal.png"/>
+                    <pic:cNvPicPr/>
+                  </pic:nvPicPr>
+                  <pic:blipFill>
+                    <a:blip r:embed="rId16"/>
+                    <a:stretch>
+                      <a:fillRect/>
+                    </a:stretch>
+                  </pic:blipFill>
+                  <pic:spPr>
+                    <a:xfrm>
+                      <a:off x="0" y="0"/>
+                      <a:ext cx="5303520" cy="3314700"/>
+                    </a:xfrm>
+                    <a:prstGeom prst="rect"/>
+                  </pic:spPr>
+                </pic:pic>
+              </a:graphicData>
+            </a:graphic>
+          </wp:inline>
+        </w:drawing>
+      </w:r>
+    </w:p>
+    <w:p>
+      <w:pPr>
+        <w:spacing w:after="240"/>
+        <w:jc w:val="center"/>
+      </w:pPr>
+      <w:r>
+        <w:rPr>
+          <w:rFonts w:ascii="Times New Roman" w:hAnsi="Times New Roman"/>
+          <w:b/>
+          <w:sz w:val="21"/>
+        </w:rPr>
         <w:t>Figure 5.5: Interactive Grade Evaluation &amp; Academic Status Modal Dialog</w:t>
       </w:r>
     </w:p>
@@ -4567,7 +4613,7 @@
         <w:drawing>
           <wp:inline xmlns:a="http://schemas.openxmlformats.org/drawingml/2006/main" xmlns:pic="http://schemas.openxmlformats.org/drawingml/2006/picture">
             <wp:extent cx="5303520" cy="3182112"/>
-            <wp:docPr id="8" name="Picture 8"/>
+            <wp:docPr id="9" name="Picture 9"/>
             <wp:cNvGraphicFramePr>
               <a:graphicFrameLocks noChangeAspect="1"/>
             </wp:cNvGraphicFramePr>
@@ -4579,7 +4625,7 @@
                     <pic:cNvPicPr/>
                   </pic:nvPicPr>
                   <pic:blipFill>
-                    <a:blip r:embed="rId16"/>
+                    <a:blip r:embed="rId17"/>
                     <a:stretch>
                       <a:fillRect/>
                     </a:stretch>

</xml_diff>